<commit_message>
Rebuild animals cover in Kitai School brand style from user photo
Compose the cover for «Названия животных по-китайски» from the uploaded
flashcard photo: crop out the baked-in banner and place the panda +
cards photo beside a burgundy brand panel (eyebrow, Cormorant title with
italic gold accent, 动物·dòngwù, subtitle, Kitai School mark). Regenerate
the docx to embed the new cover.

Co-Authored-By: Claude Opus 4.8 <noreply@anthropic.com>
Claude-Session: https://claude.ai/code/session_01CtMFsgPpC6JBW8bQZFGPdM
</commit_message>
<xml_diff>
--- a/content/blog/nazvaniya-zhivotnyh.VK.docx
+++ b/content/blog/nazvaniya-zhivotnyh.VK.docx
@@ -36,7 +36,7 @@
       <w:r>
         <w:drawing>
           <wp:inline xmlns:a="http://schemas.openxmlformats.org/drawingml/2006/main" xmlns:pic="http://schemas.openxmlformats.org/drawingml/2006/picture">
-            <wp:extent cx="4206240" cy="4206240"/>
+            <wp:extent cx="4206240" cy="2208276"/>
             <wp:docPr id="1" name="Picture 1"/>
             <wp:cNvGraphicFramePr>
               <a:graphicFrameLocks noChangeAspect="1"/>
@@ -57,7 +57,7 @@
                   <pic:spPr>
                     <a:xfrm>
                       <a:off x="0" y="0"/>
-                      <a:ext cx="4206240" cy="4206240"/>
+                      <a:ext cx="4206240" cy="2208276"/>
                     </a:xfrm>
                     <a:prstGeom prst="rect"/>
                   </pic:spPr>

</xml_diff>